<commit_message>
Signed-off-by: Student Rani Wheeza (TL_KCOMP_B_Y2) <t00244793@mymtu.ie>
</commit_message>
<xml_diff>
--- a/Table Details.docx
+++ b/Table Details.docx
@@ -62,13 +62,7 @@
         <w:t>,</w:t>
       </w:r>
       <w:r>
-        <w:t xml:space="preserve">  "</w:t>
-      </w:r>
-      <w:r>
-        <w:t>Killarney</w:t>
-      </w:r>
-      <w:r>
-        <w:t>"</w:t>
+        <w:t xml:space="preserve">  "Killarney"</w:t>
       </w:r>
       <w:r>
         <w:t>,</w:t>
@@ -471,6 +465,1064 @@
       </w:r>
       <w:r>
         <w:t>"Busy working parents seeking a caring, punctual babysitter who can help with after-school care."</w:t>
+      </w:r>
+    </w:p>
+    <w:p/>
+    <w:p>
+      <w:pPr>
+        <w:pStyle w:val="Heading1"/>
+      </w:pPr>
+      <w:r>
+        <w:t>Sitters</w:t>
+      </w:r>
+    </w:p>
+    <w:p>
+      <w:r>
+        <w:t>2003</w:t>
+      </w:r>
+      <w:r>
+        <w:t>,</w:t>
+      </w:r>
+      <w:r>
+        <w:t xml:space="preserve"> </w:t>
+      </w:r>
+      <w:r>
+        <w:t>‘</w:t>
+      </w:r>
+      <w:proofErr w:type="spellStart"/>
+      <w:r>
+        <w:t>Sarah</w:t>
+      </w:r>
+      <w:proofErr w:type="gramStart"/>
+      <w:r>
+        <w:t>’,‘</w:t>
+      </w:r>
+      <w:proofErr w:type="gramEnd"/>
+      <w:r>
+        <w:t>O'Grady</w:t>
+      </w:r>
+      <w:proofErr w:type="spellEnd"/>
+      <w:r>
+        <w:t>’,</w:t>
+      </w:r>
+      <w:r>
+        <w:t xml:space="preserve"> </w:t>
+      </w:r>
+      <w:r>
+        <w:t>‘</w:t>
+      </w:r>
+      <w:r>
+        <w:t>sarah2@gmail.com</w:t>
+      </w:r>
+      <w:r>
+        <w:t>’,</w:t>
+      </w:r>
+      <w:r>
+        <w:t xml:space="preserve"> </w:t>
+      </w:r>
+      <w:r>
+        <w:t>‘</w:t>
+      </w:r>
+      <w:r>
+        <w:t>0848261852</w:t>
+      </w:r>
+      <w:r>
+        <w:t>’,</w:t>
+      </w:r>
+      <w:r>
+        <w:t xml:space="preserve"> </w:t>
+      </w:r>
+      <w:proofErr w:type="spellStart"/>
+      <w:proofErr w:type="gramStart"/>
+      <w:r>
+        <w:t>DateTime</w:t>
+      </w:r>
+      <w:proofErr w:type="spellEnd"/>
+      <w:r>
+        <w:t>(</w:t>
+      </w:r>
+      <w:proofErr w:type="gramEnd"/>
+      <w:r>
+        <w:t>2004, 4, 21</w:t>
+      </w:r>
+      <w:proofErr w:type="gramStart"/>
+      <w:r>
+        <w:t>)</w:t>
+      </w:r>
+      <w:r>
+        <w:t>,‘</w:t>
+      </w:r>
+      <w:proofErr w:type="gramEnd"/>
+      <w:r>
+        <w:t>Dublin</w:t>
+      </w:r>
+      <w:proofErr w:type="gramStart"/>
+      <w:r>
+        <w:t>’,‘</w:t>
+      </w:r>
+      <w:proofErr w:type="gramEnd"/>
+      <w:r>
+        <w:t>Swords</w:t>
+      </w:r>
+      <w:proofErr w:type="gramStart"/>
+      <w:r>
+        <w:t>’,‘</w:t>
+      </w:r>
+      <w:proofErr w:type="gramEnd"/>
+      <w:r>
+        <w:t>14 Oakview Drive</w:t>
+      </w:r>
+      <w:proofErr w:type="gramStart"/>
+      <w:r>
+        <w:t>’,‘</w:t>
+      </w:r>
+      <w:proofErr w:type="gramEnd"/>
+      <w:r>
+        <w:t>K67 A9F2</w:t>
+      </w:r>
+      <w:r>
+        <w:t>’,</w:t>
+      </w:r>
+      <w:r>
+        <w:t>2</w:t>
+      </w:r>
+      <w:r>
+        <w:t>,</w:t>
+      </w:r>
+      <w:r>
+        <w:t>0</w:t>
+      </w:r>
+      <w:r>
+        <w:t>,</w:t>
+      </w:r>
+      <w:r>
+        <w:t>0</w:t>
+      </w:r>
+      <w:r>
+        <w:t>,</w:t>
+      </w:r>
+      <w:r>
+        <w:t xml:space="preserve"> </w:t>
+      </w:r>
+      <w:r>
+        <w:t>T</w:t>
+      </w:r>
+      <w:r>
+        <w:t>rue</w:t>
+      </w:r>
+      <w:r>
+        <w:t>,</w:t>
+      </w:r>
+      <w:r>
+        <w:t xml:space="preserve"> </w:t>
+      </w:r>
+      <w:r>
+        <w:t>F</w:t>
+      </w:r>
+      <w:r>
+        <w:t>alse</w:t>
+      </w:r>
+      <w:r>
+        <w:t>,</w:t>
+      </w:r>
+      <w:r>
+        <w:t xml:space="preserve"> </w:t>
+      </w:r>
+      <w:r>
+        <w:t>F</w:t>
+      </w:r>
+      <w:r>
+        <w:t>alse</w:t>
+      </w:r>
+      <w:r>
+        <w:t>,</w:t>
+      </w:r>
+    </w:p>
+    <w:p>
+      <w:r>
+        <w:t>F</w:t>
+      </w:r>
+      <w:r>
+        <w:t>alse</w:t>
+      </w:r>
+      <w:r>
+        <w:t>,</w:t>
+      </w:r>
+      <w:r>
+        <w:t xml:space="preserve"> </w:t>
+      </w:r>
+      <w:r>
+        <w:t>F</w:t>
+      </w:r>
+      <w:r>
+        <w:t>alse</w:t>
+      </w:r>
+      <w:r>
+        <w:t>,</w:t>
+      </w:r>
+      <w:r>
+        <w:t xml:space="preserve"> </w:t>
+      </w:r>
+      <w:r>
+        <w:t>true</w:t>
+      </w:r>
+      <w:r>
+        <w:t>,</w:t>
+      </w:r>
+      <w:r>
+        <w:t xml:space="preserve"> </w:t>
+      </w:r>
+      <w:r>
+        <w:t>T</w:t>
+      </w:r>
+      <w:r>
+        <w:t>rue</w:t>
+      </w:r>
+      <w:r>
+        <w:t>,</w:t>
+      </w:r>
+      <w:r>
+        <w:t xml:space="preserve"> </w:t>
+      </w:r>
+      <w:r>
+        <w:t>‘</w:t>
+      </w:r>
+      <w:r>
+        <w:t>Friendly and responsible sitter with 3+ years of experience caring for children of all ages. I love crafts, outdoor play, and keeping kids engaged.</w:t>
+      </w:r>
+      <w:proofErr w:type="gramStart"/>
+      <w:r>
+        <w:t>’,‘</w:t>
+      </w:r>
+      <w:proofErr w:type="gramEnd"/>
+      <w:r>
+        <w:t>13.50</w:t>
+      </w:r>
+      <w:proofErr w:type="gramStart"/>
+      <w:r>
+        <w:t>’;</w:t>
+      </w:r>
+      <w:proofErr w:type="gramEnd"/>
+    </w:p>
+    <w:p>
+      <w:r>
+        <w:t>2004</w:t>
+      </w:r>
+      <w:r>
+        <w:t>,</w:t>
+      </w:r>
+      <w:r>
+        <w:t xml:space="preserve"> </w:t>
+      </w:r>
+      <w:r>
+        <w:t>‘</w:t>
+      </w:r>
+      <w:r>
+        <w:t>Aoife</w:t>
+      </w:r>
+      <w:proofErr w:type="gramStart"/>
+      <w:r>
+        <w:t>’,‘</w:t>
+      </w:r>
+      <w:proofErr w:type="gramEnd"/>
+      <w:r>
+        <w:t>Murphy</w:t>
+      </w:r>
+      <w:proofErr w:type="gramStart"/>
+      <w:r>
+        <w:t>’,‘</w:t>
+      </w:r>
+      <w:proofErr w:type="gramEnd"/>
+      <w:r>
+        <w:t>murphy.a@gmail.com</w:t>
+      </w:r>
+      <w:proofErr w:type="gramStart"/>
+      <w:r>
+        <w:t>’,‘</w:t>
+      </w:r>
+      <w:proofErr w:type="gramEnd"/>
+      <w:r>
+        <w:t>0850379963</w:t>
+      </w:r>
+      <w:r>
+        <w:t xml:space="preserve">’, </w:t>
+      </w:r>
+      <w:proofErr w:type="spellStart"/>
+      <w:proofErr w:type="gramStart"/>
+      <w:r>
+        <w:t>DateTime</w:t>
+      </w:r>
+      <w:proofErr w:type="spellEnd"/>
+      <w:r>
+        <w:t>(</w:t>
+      </w:r>
+      <w:proofErr w:type="gramEnd"/>
+      <w:r>
+        <w:t>2006, 6, 23</w:t>
+      </w:r>
+      <w:proofErr w:type="gramStart"/>
+      <w:r>
+        <w:t>)</w:t>
+      </w:r>
+      <w:r>
+        <w:t>,‘</w:t>
+      </w:r>
+      <w:proofErr w:type="gramEnd"/>
+      <w:r>
+        <w:t>Cork</w:t>
+      </w:r>
+      <w:r>
+        <w:t>’,</w:t>
+      </w:r>
+      <w:r>
+        <w:t xml:space="preserve"> </w:t>
+      </w:r>
+      <w:r>
+        <w:t>‘</w:t>
+      </w:r>
+      <w:r>
+        <w:t>Midleton</w:t>
+      </w:r>
+      <w:r>
+        <w:t>’,</w:t>
+      </w:r>
+      <w:r>
+        <w:t xml:space="preserve"> </w:t>
+      </w:r>
+      <w:r>
+        <w:t>‘</w:t>
+      </w:r>
+      <w:r>
+        <w:t>22 Riverside Walk</w:t>
+      </w:r>
+      <w:proofErr w:type="gramStart"/>
+      <w:r>
+        <w:t>";</w:t>
+      </w:r>
+      <w:r>
+        <w:t>‘</w:t>
+      </w:r>
+      <w:proofErr w:type="gramEnd"/>
+      <w:r>
+        <w:t>P25 D3K4";4</w:t>
+      </w:r>
+      <w:r>
+        <w:t>,</w:t>
+      </w:r>
+      <w:r>
+        <w:t xml:space="preserve"> 0</w:t>
+      </w:r>
+      <w:r>
+        <w:t>,</w:t>
+      </w:r>
+      <w:r>
+        <w:t xml:space="preserve"> 1</w:t>
+      </w:r>
+      <w:r>
+        <w:t>,</w:t>
+      </w:r>
+      <w:r>
+        <w:t xml:space="preserve"> </w:t>
+      </w:r>
+      <w:r>
+        <w:t>F</w:t>
+      </w:r>
+      <w:r>
+        <w:t>alse</w:t>
+      </w:r>
+      <w:r>
+        <w:t>,</w:t>
+      </w:r>
+      <w:r>
+        <w:t xml:space="preserve"> </w:t>
+      </w:r>
+      <w:r>
+        <w:t>T</w:t>
+      </w:r>
+      <w:r>
+        <w:t>rue</w:t>
+      </w:r>
+      <w:r>
+        <w:t>,</w:t>
+      </w:r>
+      <w:r>
+        <w:t xml:space="preserve"> </w:t>
+      </w:r>
+      <w:r>
+        <w:t>T</w:t>
+      </w:r>
+      <w:r>
+        <w:t>rue</w:t>
+      </w:r>
+      <w:r>
+        <w:t>,</w:t>
+      </w:r>
+      <w:r>
+        <w:t xml:space="preserve"> </w:t>
+      </w:r>
+      <w:r>
+        <w:t>T</w:t>
+      </w:r>
+      <w:r>
+        <w:t>rue</w:t>
+      </w:r>
+      <w:r>
+        <w:t>,</w:t>
+      </w:r>
+      <w:r>
+        <w:t xml:space="preserve"> </w:t>
+      </w:r>
+      <w:r>
+        <w:t>F</w:t>
+      </w:r>
+      <w:r>
+        <w:t>alse</w:t>
+      </w:r>
+      <w:r>
+        <w:t>,</w:t>
+      </w:r>
+      <w:r>
+        <w:t xml:space="preserve"> </w:t>
+      </w:r>
+      <w:r>
+        <w:t>T</w:t>
+      </w:r>
+      <w:r>
+        <w:t>rue</w:t>
+      </w:r>
+      <w:r>
+        <w:t>,</w:t>
+      </w:r>
+      <w:r>
+        <w:t xml:space="preserve"> </w:t>
+      </w:r>
+      <w:r>
+        <w:t>F</w:t>
+      </w:r>
+      <w:r>
+        <w:t>alse</w:t>
+      </w:r>
+      <w:r>
+        <w:t>,</w:t>
+      </w:r>
+      <w:r>
+        <w:t xml:space="preserve"> </w:t>
+      </w:r>
+      <w:r>
+        <w:t>‘</w:t>
+      </w:r>
+      <w:r>
+        <w:t>Qualified childcare worker with first-aid training, available for evening and weekend babysitting. I’m patient, reliable, and great with routines.</w:t>
+      </w:r>
+      <w:r>
+        <w:t>’, ‘</w:t>
+      </w:r>
+      <w:r>
+        <w:t>15.00</w:t>
+      </w:r>
+      <w:proofErr w:type="gramStart"/>
+      <w:r>
+        <w:t>’</w:t>
+      </w:r>
+      <w:r>
+        <w:t>;</w:t>
+      </w:r>
+      <w:proofErr w:type="gramEnd"/>
+    </w:p>
+    <w:p>
+      <w:r>
+        <w:lastRenderedPageBreak/>
+        <w:t xml:space="preserve">    </w:t>
+      </w:r>
+    </w:p>
+    <w:p>
+      <w:proofErr w:type="gramStart"/>
+      <w:r>
+        <w:t>2005</w:t>
+      </w:r>
+      <w:r>
+        <w:t>,‘</w:t>
+      </w:r>
+      <w:proofErr w:type="gramEnd"/>
+      <w:r>
+        <w:t>Ciara</w:t>
+      </w:r>
+      <w:proofErr w:type="gramStart"/>
+      <w:r>
+        <w:t>’,‘</w:t>
+      </w:r>
+      <w:proofErr w:type="gramEnd"/>
+      <w:r>
+        <w:t>Donnelly</w:t>
+      </w:r>
+      <w:proofErr w:type="gramStart"/>
+      <w:r>
+        <w:t>’,‘</w:t>
+      </w:r>
+      <w:proofErr w:type="gramEnd"/>
+      <w:r>
+        <w:t>ciaradonnelly@gmail.com</w:t>
+      </w:r>
+      <w:proofErr w:type="gramStart"/>
+      <w:r>
+        <w:t>’,‘</w:t>
+      </w:r>
+      <w:proofErr w:type="gramEnd"/>
+      <w:r>
+        <w:t>0827386277</w:t>
+      </w:r>
+      <w:proofErr w:type="gramStart"/>
+      <w:r>
+        <w:t>’,</w:t>
+      </w:r>
+      <w:r>
+        <w:t>DateTime</w:t>
+      </w:r>
+      <w:proofErr w:type="gramEnd"/>
+      <w:r>
+        <w:t>(2000, 2, 27</w:t>
+      </w:r>
+      <w:r>
+        <w:t>’,</w:t>
+      </w:r>
+    </w:p>
+    <w:p>
+      <w:r>
+        <w:t>‘</w:t>
+      </w:r>
+      <w:r>
+        <w:t>Galway</w:t>
+      </w:r>
+      <w:proofErr w:type="gramStart"/>
+      <w:r>
+        <w:t>’,‘</w:t>
+      </w:r>
+      <w:proofErr w:type="gramEnd"/>
+      <w:r>
+        <w:t>Oranmore</w:t>
+      </w:r>
+      <w:proofErr w:type="gramStart"/>
+      <w:r>
+        <w:t>’,‘</w:t>
+      </w:r>
+      <w:proofErr w:type="gramEnd"/>
+      <w:r>
+        <w:t>8 Castle Road</w:t>
+      </w:r>
+      <w:proofErr w:type="gramStart"/>
+      <w:r>
+        <w:t>’,‘</w:t>
+      </w:r>
+      <w:proofErr w:type="gramEnd"/>
+      <w:r>
+        <w:t>H91 T2W7</w:t>
+      </w:r>
+      <w:r>
+        <w:t>’,</w:t>
+      </w:r>
+      <w:r>
+        <w:t>9</w:t>
+      </w:r>
+      <w:r>
+        <w:t>,</w:t>
+      </w:r>
+      <w:r>
+        <w:t>0</w:t>
+      </w:r>
+      <w:r>
+        <w:t>,</w:t>
+      </w:r>
+      <w:proofErr w:type="gramStart"/>
+      <w:r>
+        <w:t>0</w:t>
+      </w:r>
+      <w:r>
+        <w:t>,</w:t>
+      </w:r>
+      <w:r>
+        <w:t>T</w:t>
+      </w:r>
+      <w:r>
+        <w:t>rue</w:t>
+      </w:r>
+      <w:proofErr w:type="gramEnd"/>
+      <w:r>
+        <w:t>,</w:t>
+      </w:r>
+      <w:proofErr w:type="gramStart"/>
+      <w:r>
+        <w:t>T</w:t>
+      </w:r>
+      <w:r>
+        <w:t>rue</w:t>
+      </w:r>
+      <w:r>
+        <w:t>,</w:t>
+      </w:r>
+      <w:r>
+        <w:t>T</w:t>
+      </w:r>
+      <w:r>
+        <w:t>rue</w:t>
+      </w:r>
+      <w:proofErr w:type="gramEnd"/>
+      <w:r>
+        <w:t>,</w:t>
+      </w:r>
+      <w:proofErr w:type="gramStart"/>
+      <w:r>
+        <w:t>T</w:t>
+      </w:r>
+      <w:r>
+        <w:t>rue</w:t>
+      </w:r>
+      <w:r>
+        <w:t>,</w:t>
+      </w:r>
+      <w:r>
+        <w:t>T</w:t>
+      </w:r>
+      <w:r>
+        <w:t>rue</w:t>
+      </w:r>
+      <w:proofErr w:type="gramEnd"/>
+      <w:r>
+        <w:t>,</w:t>
+      </w:r>
+      <w:r>
+        <w:t>F</w:t>
+      </w:r>
+      <w:r>
+        <w:t>alse</w:t>
+      </w:r>
+      <w:r>
+        <w:t>,</w:t>
+      </w:r>
+    </w:p>
+    <w:p>
+      <w:proofErr w:type="spellStart"/>
+      <w:proofErr w:type="gramStart"/>
+      <w:r>
+        <w:t>F</w:t>
+      </w:r>
+      <w:r>
+        <w:t>alse</w:t>
+      </w:r>
+      <w:r>
+        <w:t>,</w:t>
+      </w:r>
+      <w:r>
+        <w:t>‘</w:t>
+      </w:r>
+      <w:proofErr w:type="gramEnd"/>
+      <w:r>
+        <w:t>Energetic</w:t>
+      </w:r>
+      <w:proofErr w:type="spellEnd"/>
+      <w:r>
+        <w:t xml:space="preserve"> college student studying early childhood education. I enjoy helping with homework, light meals, and fun activities.</w:t>
+      </w:r>
+      <w:proofErr w:type="gramStart"/>
+      <w:r>
+        <w:t>’,‘</w:t>
+      </w:r>
+      <w:proofErr w:type="gramEnd"/>
+      <w:r>
+        <w:t>14.80</w:t>
+      </w:r>
+      <w:proofErr w:type="gramStart"/>
+      <w:r>
+        <w:t>’</w:t>
+      </w:r>
+      <w:r>
+        <w:t>;</w:t>
+      </w:r>
+      <w:proofErr w:type="gramEnd"/>
+    </w:p>
+    <w:p>
+      <w:proofErr w:type="gramStart"/>
+      <w:r>
+        <w:t>2006</w:t>
+      </w:r>
+      <w:r>
+        <w:t>,‘</w:t>
+      </w:r>
+      <w:proofErr w:type="gramEnd"/>
+      <w:r>
+        <w:t>Saoirse</w:t>
+      </w:r>
+      <w:proofErr w:type="gramStart"/>
+      <w:r>
+        <w:t>’,‘</w:t>
+      </w:r>
+      <w:proofErr w:type="gramEnd"/>
+      <w:r>
+        <w:t>O'Sullivan</w:t>
+      </w:r>
+      <w:proofErr w:type="gramStart"/>
+      <w:r>
+        <w:t>’,‘</w:t>
+      </w:r>
+      <w:proofErr w:type="gramEnd"/>
+      <w:r>
+        <w:t>saoirseos@gmail.com</w:t>
+      </w:r>
+      <w:proofErr w:type="gramStart"/>
+      <w:r>
+        <w:t>’,‘</w:t>
+      </w:r>
+      <w:proofErr w:type="gramEnd"/>
+      <w:r>
+        <w:t>0869781639</w:t>
+      </w:r>
+      <w:proofErr w:type="gramStart"/>
+      <w:r>
+        <w:t>’,</w:t>
+      </w:r>
+      <w:r>
+        <w:t>DateTime</w:t>
+      </w:r>
+      <w:proofErr w:type="gramEnd"/>
+      <w:r>
+        <w:t>(2001, 10, 3)</w:t>
+      </w:r>
+      <w:r>
+        <w:t>,</w:t>
+      </w:r>
+    </w:p>
+    <w:p>
+      <w:r>
+        <w:t>‘</w:t>
+      </w:r>
+      <w:r>
+        <w:t>Wexford</w:t>
+      </w:r>
+      <w:proofErr w:type="gramStart"/>
+      <w:r>
+        <w:t>’,</w:t>
+      </w:r>
+      <w:r>
+        <w:t>‘</w:t>
+      </w:r>
+      <w:proofErr w:type="gramEnd"/>
+      <w:r>
+        <w:t>Gorey</w:t>
+      </w:r>
+      <w:proofErr w:type="gramStart"/>
+      <w:r>
+        <w:t>’,</w:t>
+      </w:r>
+      <w:r>
+        <w:t>‘</w:t>
+      </w:r>
+      <w:proofErr w:type="gramEnd"/>
+      <w:r>
+        <w:t>5 Meadowbrook Lane</w:t>
+      </w:r>
+      <w:proofErr w:type="gramStart"/>
+      <w:r>
+        <w:t>’,</w:t>
+      </w:r>
+      <w:r>
+        <w:t>‘</w:t>
+      </w:r>
+      <w:proofErr w:type="gramEnd"/>
+      <w:r>
+        <w:t>Y25 R9C8</w:t>
+      </w:r>
+      <w:r>
+        <w:t>’,</w:t>
+      </w:r>
+      <w:r>
+        <w:t>11</w:t>
+      </w:r>
+      <w:r>
+        <w:t>,</w:t>
+      </w:r>
+      <w:r>
+        <w:t>1</w:t>
+      </w:r>
+      <w:r>
+        <w:t>,</w:t>
+      </w:r>
+      <w:proofErr w:type="gramStart"/>
+      <w:r>
+        <w:t>0</w:t>
+      </w:r>
+      <w:r>
+        <w:t>,</w:t>
+      </w:r>
+      <w:r>
+        <w:t>F</w:t>
+      </w:r>
+      <w:r>
+        <w:t>alse</w:t>
+      </w:r>
+      <w:proofErr w:type="gramEnd"/>
+      <w:r>
+        <w:t>,</w:t>
+      </w:r>
+      <w:proofErr w:type="gramStart"/>
+      <w:r>
+        <w:t>F</w:t>
+      </w:r>
+      <w:r>
+        <w:t>alse</w:t>
+      </w:r>
+      <w:r>
+        <w:t>,</w:t>
+      </w:r>
+      <w:r>
+        <w:t>F</w:t>
+      </w:r>
+      <w:r>
+        <w:t>alse</w:t>
+      </w:r>
+      <w:proofErr w:type="gramEnd"/>
+      <w:r>
+        <w:t>,</w:t>
+      </w:r>
+      <w:r>
+        <w:t>F</w:t>
+      </w:r>
+      <w:r>
+        <w:t>alse</w:t>
+      </w:r>
+      <w:r>
+        <w:t>,</w:t>
+      </w:r>
+    </w:p>
+    <w:p>
+      <w:r>
+        <w:t>F</w:t>
+      </w:r>
+      <w:r>
+        <w:t>alse</w:t>
+      </w:r>
+      <w:r>
+        <w:t xml:space="preserve">, </w:t>
+      </w:r>
+      <w:r>
+        <w:t>T</w:t>
+      </w:r>
+      <w:r>
+        <w:t>rue</w:t>
+      </w:r>
+      <w:r>
+        <w:t xml:space="preserve">, </w:t>
+      </w:r>
+      <w:r>
+        <w:t>T</w:t>
+      </w:r>
+      <w:r>
+        <w:t>rue</w:t>
+      </w:r>
+      <w:r>
+        <w:t>, ‘</w:t>
+      </w:r>
+      <w:r>
+        <w:t>Calm, dependable babysitter experienced with infants and toddlers. Comfortable</w:t>
+      </w:r>
+      <w:r>
+        <w:t xml:space="preserve"> </w:t>
+      </w:r>
+      <w:r>
+        <w:t>with bedtime routines and creating a safe, warm environment.</w:t>
+      </w:r>
+      <w:r>
+        <w:t>’, ‘</w:t>
+      </w:r>
+      <w:r>
+        <w:t>20.00</w:t>
+      </w:r>
+      <w:proofErr w:type="gramStart"/>
+      <w:r>
+        <w:t>’</w:t>
+      </w:r>
+      <w:r>
+        <w:t>;</w:t>
+      </w:r>
+      <w:proofErr w:type="gramEnd"/>
+    </w:p>
+    <w:p>
+      <w:r>
+        <w:t>2007</w:t>
+      </w:r>
+      <w:r>
+        <w:t>,’</w:t>
+      </w:r>
+      <w:r>
+        <w:t>Caoimhe</w:t>
+      </w:r>
+      <w:proofErr w:type="gramStart"/>
+      <w:r>
+        <w:t>’,‘</w:t>
+      </w:r>
+      <w:proofErr w:type="gramEnd"/>
+      <w:r>
+        <w:t>Walsh</w:t>
+      </w:r>
+      <w:proofErr w:type="gramStart"/>
+      <w:r>
+        <w:t>’,‘</w:t>
+      </w:r>
+      <w:proofErr w:type="gramEnd"/>
+      <w:r>
+        <w:t>walshc@gmail.com</w:t>
+      </w:r>
+      <w:proofErr w:type="gramStart"/>
+      <w:r>
+        <w:t>’,</w:t>
+      </w:r>
+      <w:r>
+        <w:t>DateTime</w:t>
+      </w:r>
+      <w:proofErr w:type="gramEnd"/>
+      <w:r>
+        <w:t>(1999,5,12</w:t>
+      </w:r>
+      <w:proofErr w:type="gramStart"/>
+      <w:r>
+        <w:t>)</w:t>
+      </w:r>
+      <w:r>
+        <w:t>,‘</w:t>
+      </w:r>
+      <w:proofErr w:type="gramEnd"/>
+      <w:r>
+        <w:t>Limerick</w:t>
+      </w:r>
+      <w:r>
+        <w:t>’,</w:t>
+      </w:r>
+    </w:p>
+    <w:p>
+      <w:r>
+        <w:t>‘</w:t>
+      </w:r>
+      <w:r>
+        <w:t>Newcastle West</w:t>
+      </w:r>
+      <w:proofErr w:type="gramStart"/>
+      <w:r>
+        <w:t>’,‘</w:t>
+      </w:r>
+      <w:proofErr w:type="gramEnd"/>
+      <w:r>
+        <w:t>31 Ashwood Grove</w:t>
+      </w:r>
+      <w:proofErr w:type="gramStart"/>
+      <w:r>
+        <w:t>’,‘</w:t>
+      </w:r>
+      <w:proofErr w:type="gramEnd"/>
+      <w:r>
+        <w:t>V42 P6H0</w:t>
+      </w:r>
+      <w:r>
+        <w:t>’,</w:t>
+      </w:r>
+      <w:r>
+        <w:t>7</w:t>
+      </w:r>
+      <w:r>
+        <w:t>,</w:t>
+      </w:r>
+      <w:r>
+        <w:t>1</w:t>
+      </w:r>
+      <w:r>
+        <w:t>,</w:t>
+      </w:r>
+      <w:proofErr w:type="gramStart"/>
+      <w:r>
+        <w:t>1</w:t>
+      </w:r>
+      <w:r>
+        <w:t>,</w:t>
+      </w:r>
+      <w:r>
+        <w:t>T</w:t>
+      </w:r>
+      <w:r>
+        <w:t>rue</w:t>
+      </w:r>
+      <w:proofErr w:type="gramEnd"/>
+      <w:r>
+        <w:t>,</w:t>
+      </w:r>
+      <w:proofErr w:type="gramStart"/>
+      <w:r>
+        <w:t>F</w:t>
+      </w:r>
+      <w:r>
+        <w:t>alse</w:t>
+      </w:r>
+      <w:r>
+        <w:t>,</w:t>
+      </w:r>
+      <w:r>
+        <w:t>T</w:t>
+      </w:r>
+      <w:r>
+        <w:t>rue</w:t>
+      </w:r>
+      <w:proofErr w:type="gramEnd"/>
+      <w:r>
+        <w:t>,</w:t>
+      </w:r>
+      <w:r>
+        <w:t>false</w:t>
+      </w:r>
+      <w:r>
+        <w:t>,</w:t>
+      </w:r>
+      <w:r>
+        <w:t xml:space="preserve"> true</w:t>
+      </w:r>
+      <w:r>
+        <w:t>,</w:t>
+      </w:r>
+    </w:p>
+    <w:p>
+      <w:r>
+        <w:t>false</w:t>
+      </w:r>
+      <w:r>
+        <w:t xml:space="preserve">, </w:t>
+      </w:r>
+      <w:r>
+        <w:t>false</w:t>
+      </w:r>
+      <w:r>
+        <w:t>, ‘</w:t>
+      </w:r>
+      <w:r>
+        <w:t xml:space="preserve">Creative and upbeat sitter who loves games, storytelling, and supporting kids’ </w:t>
+      </w:r>
+      <w:proofErr w:type="gramStart"/>
+      <w:r>
+        <w:t>interests</w:t>
+      </w:r>
+      <w:r>
+        <w:t>,‘</w:t>
+      </w:r>
+      <w:proofErr w:type="gramEnd"/>
+      <w:r>
+        <w:t>14.00</w:t>
+      </w:r>
+      <w:proofErr w:type="gramStart"/>
+      <w:r>
+        <w:t>’;</w:t>
+      </w:r>
+      <w:proofErr w:type="gramEnd"/>
+    </w:p>
+    <w:p>
+      <w:pPr>
+        <w:pStyle w:val="Heading1"/>
+      </w:pPr>
+      <w:r>
+        <w:t>Bookings</w:t>
       </w:r>
     </w:p>
     <w:p/>
@@ -912,7 +1964,6 @@
     <w:next w:val="Normal"/>
     <w:link w:val="Heading2Char"/>
     <w:uiPriority w:val="9"/>
-    <w:semiHidden/>
     <w:unhideWhenUsed/>
     <w:qFormat/>
     <w:rsid w:val="002864DD"/>
@@ -1128,7 +2179,6 @@
     <w:basedOn w:val="DefaultParagraphFont"/>
     <w:link w:val="Heading2"/>
     <w:uiPriority w:val="9"/>
-    <w:semiHidden/>
     <w:rsid w:val="002864DD"/>
     <w:rPr>
       <w:rFonts w:asciiTheme="majorHAnsi" w:eastAsiaTheme="majorEastAsia" w:hAnsiTheme="majorHAnsi" w:cstheme="majorBidi"/>

</xml_diff>